<commit_message>
Add OMR audit, calibration records, and lockfile SBOMs
</commit_message>
<xml_diff>
--- a/docs/research/Project-KIT-Technology-Research-Materials.docx
+++ b/docs/research/Project-KIT-Technology-Research-Materials.docx
@@ -904,6 +904,318 @@
           </w:p>
         </w:tc>
       </w:tr>
+      <w:tr>
+        <w:trPr>
+          <w:cantSplit/>
+        </w:trPr>
+        <w:tc>
+          <w:tcPr>
+            <w:tcW w:type="pct" w:w="22%"/>
+            <w:tcBorders>
+              <w:top w:val="single" w:color="CBD5E1" w:sz="1"/>
+              <w:left w:val="single" w:color="CBD5E1" w:sz="1"/>
+              <w:bottom w:val="single" w:color="CBD5E1" w:sz="1"/>
+              <w:right w:val="single" w:color="CBD5E1" w:sz="1"/>
+            </w:tcBorders>
+            <w:tcMar>
+              <w:top w:type="dxa" w:w="90"/>
+              <w:left w:type="dxa" w:w="100"/>
+              <w:bottom w:type="dxa" w:w="90"/>
+              <w:right w:type="dxa" w:w="100"/>
+            </w:tcMar>
+          </w:tcPr>
+          <w:p>
+            <w:pPr>
+              <w:spacing w:after="0"/>
+            </w:pPr>
+            <w:r>
+              <w:rPr>
+                <w:b w:val="false"/>
+                <w:bCs w:val="false"/>
+                <w:color w:val="263445"/>
+                <w:sz w:val="17"/>
+                <w:szCs w:val="17"/>
+                <w:rFonts w:ascii="Aptos" w:cs="Aptos" w:eastAsia="Aptos" w:hAnsi="Aptos"/>
+              </w:rPr>
+              <w:t xml:space="preserve">SBOM inventory</w:t>
+            </w:r>
+          </w:p>
+        </w:tc>
+        <w:tc>
+          <w:tcPr>
+            <w:tcW w:type="pct" w:w="31%"/>
+            <w:tcBorders>
+              <w:top w:val="single" w:color="CBD5E1" w:sz="1"/>
+              <w:left w:val="single" w:color="CBD5E1" w:sz="1"/>
+              <w:bottom w:val="single" w:color="CBD5E1" w:sz="1"/>
+              <w:right w:val="single" w:color="CBD5E1" w:sz="1"/>
+            </w:tcBorders>
+            <w:tcMar>
+              <w:top w:type="dxa" w:w="90"/>
+              <w:left w:type="dxa" w:w="100"/>
+              <w:bottom w:type="dxa" w:w="90"/>
+              <w:right w:type="dxa" w:w="100"/>
+            </w:tcMar>
+          </w:tcPr>
+          <w:p>
+            <w:pPr>
+              <w:spacing w:after="0"/>
+            </w:pPr>
+            <w:r>
+              <w:rPr>
+                <w:b w:val="false"/>
+                <w:bCs w:val="false"/>
+                <w:color w:val="263445"/>
+                <w:sz w:val="17"/>
+                <w:szCs w:val="17"/>
+                <w:rFonts w:ascii="Aptos" w:cs="Aptos" w:eastAsia="Aptos" w:hAnsi="Aptos"/>
+              </w:rPr>
+              <w:t xml:space="preserve">frontend/scripts/generate-sboms.mjs; frontend/docs/research/sbom/*.cdx.json</w:t>
+            </w:r>
+          </w:p>
+        </w:tc>
+        <w:tc>
+          <w:tcPr>
+            <w:tcW w:type="pct" w:w="47%"/>
+            <w:tcBorders>
+              <w:top w:val="single" w:color="CBD5E1" w:sz="1"/>
+              <w:left w:val="single" w:color="CBD5E1" w:sz="1"/>
+              <w:bottom w:val="single" w:color="CBD5E1" w:sz="1"/>
+              <w:right w:val="single" w:color="CBD5E1" w:sz="1"/>
+            </w:tcBorders>
+            <w:tcMar>
+              <w:top w:type="dxa" w:w="90"/>
+              <w:left w:type="dxa" w:w="100"/>
+              <w:bottom w:type="dxa" w:w="90"/>
+              <w:right w:type="dxa" w:w="100"/>
+            </w:tcMar>
+          </w:tcPr>
+          <w:p>
+            <w:pPr>
+              <w:spacing w:after="0"/>
+            </w:pPr>
+            <w:r>
+              <w:rPr>
+                <w:b w:val="false"/>
+                <w:bCs w:val="false"/>
+                <w:color w:val="263445"/>
+                <w:sz w:val="17"/>
+                <w:szCs w:val="17"/>
+                <w:rFonts w:ascii="Aptos" w:cs="Aptos" w:eastAsia="Aptos" w:hAnsi="Aptos"/>
+              </w:rPr>
+              <w:t xml:space="preserve">CycloneDX inventories generated from exact lockfile entries, including transitive, development, and optional packages.</w:t>
+            </w:r>
+          </w:p>
+        </w:tc>
+      </w:tr>
+      <w:tr>
+        <w:trPr>
+          <w:cantSplit/>
+        </w:trPr>
+        <w:tc>
+          <w:tcPr>
+            <w:tcW w:type="pct" w:w="22%"/>
+            <w:tcBorders>
+              <w:top w:val="single" w:color="CBD5E1" w:sz="1"/>
+              <w:left w:val="single" w:color="CBD5E1" w:sz="1"/>
+              <w:bottom w:val="single" w:color="CBD5E1" w:sz="1"/>
+              <w:right w:val="single" w:color="CBD5E1" w:sz="1"/>
+            </w:tcBorders>
+            <w:tcMar>
+              <w:top w:type="dxa" w:w="90"/>
+              <w:left w:type="dxa" w:w="100"/>
+              <w:bottom w:type="dxa" w:w="90"/>
+              <w:right w:type="dxa" w:w="100"/>
+            </w:tcMar>
+          </w:tcPr>
+          <w:p>
+            <w:pPr>
+              <w:spacing w:after="0"/>
+            </w:pPr>
+            <w:r>
+              <w:rPr>
+                <w:b w:val="false"/>
+                <w:bCs w:val="false"/>
+                <w:color w:val="263445"/>
+                <w:sz w:val="17"/>
+                <w:szCs w:val="17"/>
+                <w:rFonts w:ascii="Aptos" w:cs="Aptos" w:eastAsia="Aptos" w:hAnsi="Aptos"/>
+              </w:rPr>
+              <w:t xml:space="preserve">OMR calibration record</w:t>
+            </w:r>
+          </w:p>
+        </w:tc>
+        <w:tc>
+          <w:tcPr>
+            <w:tcW w:type="pct" w:w="31%"/>
+            <w:tcBorders>
+              <w:top w:val="single" w:color="CBD5E1" w:sz="1"/>
+              <w:left w:val="single" w:color="CBD5E1" w:sz="1"/>
+              <w:bottom w:val="single" w:color="CBD5E1" w:sz="1"/>
+              <w:right w:val="single" w:color="CBD5E1" w:sz="1"/>
+            </w:tcBorders>
+            <w:tcMar>
+              <w:top w:type="dxa" w:w="90"/>
+              <w:left w:type="dxa" w:w="100"/>
+              <w:bottom w:type="dxa" w:w="90"/>
+              <w:right w:type="dxa" w:w="100"/>
+            </w:tcMar>
+          </w:tcPr>
+          <w:p>
+            <w:pPr>
+              <w:spacing w:after="0"/>
+            </w:pPr>
+            <w:r>
+              <w:rPr>
+                <w:b w:val="false"/>
+                <w:bCs w:val="false"/>
+                <w:color w:val="263445"/>
+                <w:sz w:val="17"/>
+                <w:szCs w:val="17"/>
+                <w:rFonts w:ascii="Aptos" w:cs="Aptos" w:eastAsia="Aptos" w:hAnsi="Aptos"/>
+              </w:rPr>
+              <w:t xml:space="preserve">frontend/docs/research/omr-validation.md; omr-validation-dataset-template.csv</w:t>
+            </w:r>
+          </w:p>
+        </w:tc>
+        <w:tc>
+          <w:tcPr>
+            <w:tcW w:type="pct" w:w="47%"/>
+            <w:tcBorders>
+              <w:top w:val="single" w:color="CBD5E1" w:sz="1"/>
+              <w:left w:val="single" w:color="CBD5E1" w:sz="1"/>
+              <w:bottom w:val="single" w:color="CBD5E1" w:sz="1"/>
+              <w:right w:val="single" w:color="CBD5E1" w:sz="1"/>
+            </w:tcBorders>
+            <w:tcMar>
+              <w:top w:type="dxa" w:w="90"/>
+              <w:left w:type="dxa" w:w="100"/>
+              <w:bottom w:type="dxa" w:w="90"/>
+              <w:right w:type="dxa" w:w="100"/>
+            </w:tcMar>
+          </w:tcPr>
+          <w:p>
+            <w:pPr>
+              <w:spacing w:after="0"/>
+            </w:pPr>
+            <w:r>
+              <w:rPr>
+                <w:b w:val="false"/>
+                <w:bCs w:val="false"/>
+                <w:color w:val="263445"/>
+                <w:sz w:val="17"/>
+                <w:szCs w:val="17"/>
+                <w:rFonts w:ascii="Aptos" w:cs="Aptos" w:eastAsia="Aptos" w:hAnsi="Aptos"/>
+              </w:rPr>
+              <w:t xml:space="preserve">Versioned thresholds, dataset protocol, evaluation metrics, and pending-baseline status.</w:t>
+            </w:r>
+          </w:p>
+        </w:tc>
+      </w:tr>
+      <w:tr>
+        <w:trPr>
+          <w:cantSplit/>
+        </w:trPr>
+        <w:tc>
+          <w:tcPr>
+            <w:tcW w:type="pct" w:w="22%"/>
+            <w:tcBorders>
+              <w:top w:val="single" w:color="CBD5E1" w:sz="1"/>
+              <w:left w:val="single" w:color="CBD5E1" w:sz="1"/>
+              <w:bottom w:val="single" w:color="CBD5E1" w:sz="1"/>
+              <w:right w:val="single" w:color="CBD5E1" w:sz="1"/>
+            </w:tcBorders>
+            <w:tcMar>
+              <w:top w:type="dxa" w:w="90"/>
+              <w:left w:type="dxa" w:w="100"/>
+              <w:bottom w:type="dxa" w:w="90"/>
+              <w:right w:type="dxa" w:w="100"/>
+            </w:tcMar>
+          </w:tcPr>
+          <w:p>
+            <w:pPr>
+              <w:spacing w:after="0"/>
+            </w:pPr>
+            <w:r>
+              <w:rPr>
+                <w:b w:val="false"/>
+                <w:bCs w:val="false"/>
+                <w:color w:val="263445"/>
+                <w:sz w:val="17"/>
+                <w:szCs w:val="17"/>
+                <w:rFonts w:ascii="Aptos" w:cs="Aptos" w:eastAsia="Aptos" w:hAnsi="Aptos"/>
+              </w:rPr>
+              <w:t xml:space="preserve">OpenCV asset measurement</w:t>
+            </w:r>
+          </w:p>
+        </w:tc>
+        <w:tc>
+          <w:tcPr>
+            <w:tcW w:type="pct" w:w="31%"/>
+            <w:tcBorders>
+              <w:top w:val="single" w:color="CBD5E1" w:sz="1"/>
+              <w:left w:val="single" w:color="CBD5E1" w:sz="1"/>
+              <w:bottom w:val="single" w:color="CBD5E1" w:sz="1"/>
+              <w:right w:val="single" w:color="CBD5E1" w:sz="1"/>
+            </w:tcBorders>
+            <w:tcMar>
+              <w:top w:type="dxa" w:w="90"/>
+              <w:left w:type="dxa" w:w="100"/>
+              <w:bottom w:type="dxa" w:w="90"/>
+              <w:right w:type="dxa" w:w="100"/>
+            </w:tcMar>
+          </w:tcPr>
+          <w:p>
+            <w:pPr>
+              <w:spacing w:after="0"/>
+            </w:pPr>
+            <w:r>
+              <w:rPr>
+                <w:b w:val="false"/>
+                <w:bCs w:val="false"/>
+                <w:color w:val="263445"/>
+                <w:sz w:val="17"/>
+                <w:szCs w:val="17"/>
+                <w:rFonts w:ascii="Aptos" w:cs="Aptos" w:eastAsia="Aptos" w:hAnsi="Aptos"/>
+              </w:rPr>
+              <w:t xml:space="preserve">frontend/scripts/report-opencv-bundle.mjs; frontend/docs/research/opencv-asset-size.json</w:t>
+            </w:r>
+          </w:p>
+        </w:tc>
+        <w:tc>
+          <w:tcPr>
+            <w:tcW w:type="pct" w:w="47%"/>
+            <w:tcBorders>
+              <w:top w:val="single" w:color="CBD5E1" w:sz="1"/>
+              <w:left w:val="single" w:color="CBD5E1" w:sz="1"/>
+              <w:bottom w:val="single" w:color="CBD5E1" w:sz="1"/>
+              <w:right w:val="single" w:color="CBD5E1" w:sz="1"/>
+            </w:tcBorders>
+            <w:tcMar>
+              <w:top w:type="dxa" w:w="90"/>
+              <w:left w:type="dxa" w:w="100"/>
+              <w:bottom w:type="dxa" w:w="90"/>
+              <w:right w:type="dxa" w:w="100"/>
+            </w:tcMar>
+          </w:tcPr>
+          <w:p>
+            <w:pPr>
+              <w:spacing w:after="0"/>
+            </w:pPr>
+            <w:r>
+              <w:rPr>
+                <w:b w:val="false"/>
+                <w:bCs w:val="false"/>
+                <w:color w:val="263445"/>
+                <w:sz w:val="17"/>
+                <w:szCs w:val="17"/>
+                <w:rFonts w:ascii="Aptos" w:cs="Aptos" w:eastAsia="Aptos" w:hAnsi="Aptos"/>
+              </w:rPr>
+              <w:t xml:space="preserve">Recorded raw and gzip size of the OpenCV.js runtime artifact.</w:t>
+            </w:r>
+          </w:p>
+        </w:tc>
+      </w:tr>
     </w:tbl>
     <w:p>
       <w:pPr>
@@ -8686,6 +8998,20 @@
         <w:t xml:space="preserve">The current scanner uses a bundled OpenCV.js runtime through @techstark/opencv-js 4.12.0-release.1. The frontend adapter routes scan analysis through the Project KIT optical engine. That engine batches pixel samples to a module Web Worker, which converts RGBA pixels to grayscale, applies adaptive Gaussian thresholding, and measures bubble fill ratio and local contrast. OpenCV matrix allocations are released after each analysis pass.</w:t>
       </w:r>
     </w:p>
+    <w:p>
+      <w:pPr>
+        <w:spacing w:after="120" w:line="280"/>
+      </w:pPr>
+      <w:r>
+        <w:rPr>
+          <w:color w:val="263445"/>
+          <w:sz w:val="20"/>
+          <w:szCs w:val="20"/>
+          <w:rFonts w:ascii="Aptos" w:cs="Aptos" w:eastAsia="Aptos" w:hAnsi="Aptos"/>
+        </w:rPr>
+        <w:t xml:space="preserve">The scanner worker is instantiated only when analysis is requested. Worker initialization and per-capture analysis durations are returned as diagnostics. A worker error, timeout, or incomplete response fails the OpenCV pass, terminates the failed worker, and leaves the scan in the review-required path; a later attempt can create a fresh worker.</w:t>
+      </w:r>
+    </w:p>
     <w:tbl>
       <w:tblPr>
         <w:tblW w:type="pct" w:w="100%"/>
@@ -10037,7 +10363,7 @@
           <w:szCs w:val="30"/>
           <w:rFonts w:ascii="Aptos" w:cs="Aptos" w:eastAsia="Aptos" w:hAnsi="Aptos"/>
         </w:rPr>
-        <w:t xml:space="preserve">Research notes and improvement opportunities</w:t>
+        <w:t xml:space="preserve">Research maintenance and validation status</w:t>
       </w:r>
     </w:p>
     <w:p>
@@ -10056,7 +10382,7 @@
           <w:szCs w:val="20"/>
           <w:rFonts w:ascii="Aptos" w:cs="Aptos" w:eastAsia="Aptos" w:hAnsi="Aptos"/>
         </w:rPr>
-        <w:t xml:space="preserve">Maintain a dependency/software bill of materials (SBOM) from each lockfile for exact transitive package versions; this document intentionally catalogs direct declarations only.</w:t>
+        <w:t xml:space="preserve">Run `npm run sbom` from the frontend workspace to regenerate CycloneDX SBOMs from the frontend, backend, and helper package lockfiles. The generator includes exact locked transitive, development, and optional package entries.</w:t>
       </w:r>
     </w:p>
     <w:p>
@@ -10075,7 +10401,7 @@
           <w:szCs w:val="20"/>
           <w:rFonts w:ascii="Aptos" w:cs="Aptos" w:eastAsia="Aptos" w:hAnsi="Aptos"/>
         </w:rPr>
-        <w:t xml:space="preserve">Treat the backend README as a scaffold-era source: it mentions Prisma workflows that are not reflected in the current backend package scripts or dependency manifest. Confirm the live database workflow from migrations and current code before relying on that README.</w:t>
+        <w:t xml:space="preserve">The backend README contains scaffold-era Prisma instructions that do not match the current manifest/scripts. For the current database workflow, inspect the Supabase SQL migrations and source rather than relying on those stale instructions.</w:t>
       </w:r>
     </w:p>
     <w:p>
@@ -10094,7 +10420,7 @@
           <w:szCs w:val="20"/>
           <w:rFonts w:ascii="Aptos" w:cs="Aptos" w:eastAsia="Aptos" w:hAnsi="Aptos"/>
         </w:rPr>
-        <w:t xml:space="preserve">Record OMR validation datasets and operating thresholds with each release. Include clean marks, faint marks, erased marks, multiple marks, rotated/cropped sheets, glare, and low-resolution captures.</w:t>
+        <w:t xml:space="preserve">The versioned OMR profile and release data-collection/evaluation protocol are in docs/research/omr-validation.md. A labeled photographic dataset has not yet been collected, so accuracy and error rates are explicitly pending measurement.</w:t>
       </w:r>
     </w:p>
     <w:p>
@@ -10113,7 +10439,7 @@
           <w:szCs w:val="20"/>
           <w:rFonts w:ascii="Aptos" w:cs="Aptos" w:eastAsia="Aptos" w:hAnsi="Aptos"/>
         </w:rPr>
-        <w:t xml:space="preserve">Keep OCR/OMR review outcomes auditable: retain the machine interpretation, confidence/reason flags, teacher correction, and final saved answer as separate data.</w:t>
+        <w:t xml:space="preserve">Staged scan reviews retain machine choice/state/scores/confidence/reason flags, teacher choice/change, final choice/state, engine, OpenCV diagnostics, and threshold-profile version in the existing JSONB scan record.</w:t>
       </w:r>
     </w:p>
     <w:p>
@@ -10132,7 +10458,7 @@
           <w:szCs w:val="20"/>
           <w:rFonts w:ascii="Aptos" w:cs="Aptos" w:eastAsia="Aptos" w:hAnsi="Aptos"/>
         </w:rPr>
-        <w:t xml:space="preserve">Track the OpenCV.js asset size and worker initialization time; lazy-load the scanner path and ensure worker failures lead to a reviewable fallback rather than silent answer acceptance.</w:t>
+        <w:t xml:space="preserve">Run `npm run report:opencv-bundle` to measure the source runtime size or pass the emitted runtime asset path. Measurements append to docs/research/opencv-asset-size.json for release history. Worker readiness and analysis duration are recorded at runtime. The OpenCV runtime is isolated behind the scanner worker bridge.</w:t>
       </w:r>
     </w:p>
     <w:p>

</xml_diff>